<commit_message>
docs v6.0.9: GUIA_DE_TESTE_NF.html carimbado 6.0.9 (título/rodapé/passo de leitura do rodapé; A6 marcado como 'novidade da 6.0.7, ainda vale') + RELATORIO_EM_BRANCO_TESTE.docx recarimbado 6.0.9 (4 ocorrências no document.xml, zip/XML puro, docx validado). Casaco desfeito: dashboard_inicio_clicavel_patch.js tinha sido reescrito por engano nesta sessão — restaurado via git checkout (byte a byte do commitado); bundle regenerado idêntico (sha 201e539e5d7b89ab), suíte 175/175 de novo.
Co-authored-by: arena-agent <297053741+arena-agent@users.noreply.github.com>
</commit_message>
<xml_diff>
--- a/RELATORIO_EM_BRANCO_TESTE.docx
+++ b/RELATORIO_EM_BRANCO_TESTE.docx
@@ -12,7 +12,7 @@
           <w:color w:val="0A1E8A"/>
           <w:sz w:val="32"/>
         </w:rPr>
-        <w:t xml:space="preserve">Relatório de Teste — Sistema Digicopy v6.0.7</w:t>
+        <w:t xml:space="preserve">Relatório de Teste — Sistema Digicopy v6.0.9</w:t>
       </w:r>
     </w:p>
     <w:p>
@@ -23,7 +23,7 @@
         <w:rPr>
           <w:sz w:val="22"/>
         </w:rPr>
-        <w:t xml:space="preserve">Teste da versão 6.0.7 (Início sem "undefined" + itens clicáveis, menu fiscal completo, permissões e estorno).</w:t>
+        <w:t xml:space="preserve">Teste da versão 6.0.9 (Início sem "undefined" + itens clicáveis, menu fiscal completo, permissões e estorno).</w:t>
       </w:r>
     </w:p>
     <w:p>
@@ -222,7 +222,7 @@
               <w:rPr>
                 <w:sz w:val="20"/>
               </w:rPr>
-              <w:t xml:space="preserve">O rodapé mostrava v6.0.7? (sim/não)</w:t>
+              <w:t xml:space="preserve">O rodapé mostrava v6.0.9? (sim/não)</w:t>
             </w:r>
           </w:p>
         </w:tc>
@@ -2678,7 +2678,7 @@
           <w:color w:val="64748B"/>
           <w:sz w:val="18"/>
         </w:rPr>
-        <w:t xml:space="preserve">Versão testada: v6.0.7 (app) · guia: teste-60f.pages.dev/GUIA_DE_TESTE_NF.html</w:t>
+        <w:t xml:space="preserve">Versão testada: v6.0.9 (app) · guia: teste-60f.pages.dev/GUIA_DE_TESTE_NF.html</w:t>
       </w:r>
     </w:p>
     <w:sectPr>

</xml_diff>

<commit_message>
v6.1.0 — MENU FISCAL OFICIAL: faixa do topo se chama Menu Fiscal (não mais NF-e/NFC-e), os 6 itens ficam SEMPRE lá em cima (bug do sumiço no re-render interno corrigido por wrap do __fxReRender614 + sonda), beleza nas 6 telas (CSS), importador CLIENTES.json na página de envio (DEL=S pula; documento/código não duplica; só completa campo vazio)
• menu_fiscal_oficial_patch.js (220º): observer renomeia a aba + flyout via CSS; wrap preserva .wxr-bar no instante; MFO610_PURE mapeia cliente do sistema antigo
• envio_arquivos.html: card Clientes + handler inline (entidade clientes, contadores novos/completados/iguais)
• suíte 181/0/0 duas vezes; re-âncora 155 carimbos + lengths 220 + caudas +1; guia +A10; docx 4 subs

Signed-off-by: agent

Co-authored-by: arena-agent <297053741+arena-agent@users.noreply.github.com>
</commit_message>
<xml_diff>
--- a/RELATORIO_EM_BRANCO_TESTE.docx
+++ b/RELATORIO_EM_BRANCO_TESTE.docx
@@ -12,7 +12,7 @@
           <w:color w:val="0A1E8A"/>
           <w:sz w:val="32"/>
         </w:rPr>
-        <w:t xml:space="preserve">Relatório de Teste — Sistema Digicopy v6.0.14</w:t>
+        <w:t xml:space="preserve">Relatório de Teste — Sistema Digicopy v6.1.0</w:t>
       </w:r>
     </w:p>
     <w:p>
@@ -23,7 +23,7 @@
         <w:rPr>
           <w:sz w:val="22"/>
         </w:rPr>
-        <w:t xml:space="preserve">Teste da versão 6.0.14 (Início sem "undefined" + itens clicáveis, menu fiscal completo, permissões e estorno).</w:t>
+        <w:t xml:space="preserve">Teste da versão 6.1.0 (Início sem "undefined" + itens clicáveis, menu fiscal completo, permissões e estorno).</w:t>
       </w:r>
     </w:p>
     <w:p>
@@ -222,7 +222,7 @@
               <w:rPr>
                 <w:sz w:val="20"/>
               </w:rPr>
-              <w:t xml:space="preserve">O rodapé mostrava v6.0.14? (sim/não)</w:t>
+              <w:t xml:space="preserve">O rodapé mostrava v6.1.0? (sim/não)</w:t>
             </w:r>
           </w:p>
         </w:tc>
@@ -2678,7 +2678,7 @@
           <w:color w:val="64748B"/>
           <w:sz w:val="18"/>
         </w:rPr>
-        <w:t xml:space="preserve">Versão testada: v6.0.14 (app) · guia: teste-60f.pages.dev/GUIA_DE_TESTE_NF.html</w:t>
+        <w:t xml:space="preserve">Versão testada: v6.1.0 (app) · guia: teste-60f.pages.dev/GUIA_DE_TESTE_NF.html</w:t>
       </w:r>
     </w:p>
     <w:sectPr>

</xml_diff>

<commit_message>
v6.1.1 — MENU FISCAL DO JEITO CERTO: a faixa das telas está DESLIGADA (nada aparece ao clicar em Nota Fiscal); a aba passa a ser oficialmente FISCAL e o submenu dos 6 ABRE E FICA FIXO no clique (barra e lateral); mapeador CLIENTES alinhado ao banco real dele (COD_CLIENTE/NOME_RAZAOSOCIAL/CPF_CNPJ/RG_IE/cobrança separada/NFE_*), sem importar nada
• submenu_fiscal_oficial_patch.js (221º): .wxr-bar morta por CSS; capture listener abre/pin o submenu; renomeia pai na barra e no flyout; SFO611_PURE com a amostra real
• envio_arquivos.html: mapeador inline segue o dump real + fundir protege cadastro manual
• v60011 re-ancorada com nota supersede; suíte 182/0/0 duas vezes; guia +A11; docx 4 subs

Signed-off-by: agent

Co-authored-by: arena-agent <297053741+arena-agent@users.noreply.github.com>
</commit_message>
<xml_diff>
--- a/RELATORIO_EM_BRANCO_TESTE.docx
+++ b/RELATORIO_EM_BRANCO_TESTE.docx
@@ -12,7 +12,7 @@
           <w:color w:val="0A1E8A"/>
           <w:sz w:val="32"/>
         </w:rPr>
-        <w:t xml:space="preserve">Relatório de Teste — Sistema Digicopy v6.1.0</w:t>
+        <w:t xml:space="preserve">Relatório de Teste — Sistema Digicopy v6.1.1</w:t>
       </w:r>
     </w:p>
     <w:p>
@@ -23,7 +23,7 @@
         <w:rPr>
           <w:sz w:val="22"/>
         </w:rPr>
-        <w:t xml:space="preserve">Teste da versão 6.1.0 (Início sem "undefined" + itens clicáveis, menu fiscal completo, permissões e estorno).</w:t>
+        <w:t xml:space="preserve">Teste da versão 6.1.1 (Início sem "undefined" + itens clicáveis, menu fiscal completo, permissões e estorno).</w:t>
       </w:r>
     </w:p>
     <w:p>
@@ -222,7 +222,7 @@
               <w:rPr>
                 <w:sz w:val="20"/>
               </w:rPr>
-              <w:t xml:space="preserve">O rodapé mostrava v6.1.0? (sim/não)</w:t>
+              <w:t xml:space="preserve">O rodapé mostrava v6.1.1? (sim/não)</w:t>
             </w:r>
           </w:p>
         </w:tc>
@@ -2678,7 +2678,7 @@
           <w:color w:val="64748B"/>
           <w:sz w:val="18"/>
         </w:rPr>
-        <w:t xml:space="preserve">Versão testada: v6.1.0 (app) · guia: teste-60f.pages.dev/GUIA_DE_TESTE_NF.html</w:t>
+        <w:t xml:space="preserve">Versão testada: v6.1.1 (app) · guia: teste-60f.pages.dev/GUIA_DE_TESTE_NF.html</w:t>
       </w:r>
     </w:p>
     <w:sectPr>

</xml_diff>

<commit_message>
v6.1.2 — navegacao Fiscal firme na barra reconstruida + escuro integro (E2E 23/23, suite 183/0/0)
Co-authored-by: arena-agent <297053741+arena-agent@users.noreply.github.com>
</commit_message>
<xml_diff>
--- a/RELATORIO_EM_BRANCO_TESTE.docx
+++ b/RELATORIO_EM_BRANCO_TESTE.docx
@@ -12,7 +12,7 @@
           <w:color w:val="0A1E8A"/>
           <w:sz w:val="32"/>
         </w:rPr>
-        <w:t xml:space="preserve">Relatório de Teste — Sistema Digicopy v6.1.1</w:t>
+        <w:t xml:space="preserve">Relatório de Teste — Sistema Digicopy v6.1.2</w:t>
       </w:r>
     </w:p>
     <w:p>
@@ -23,7 +23,7 @@
         <w:rPr>
           <w:sz w:val="22"/>
         </w:rPr>
-        <w:t xml:space="preserve">Teste da versão 6.1.1 (Início sem "undefined" + itens clicáveis, menu fiscal completo, permissões e estorno).</w:t>
+        <w:t xml:space="preserve">Teste da versão 6.1.2 (Início sem "undefined" + itens clicáveis, menu fiscal completo, permissões e estorno).</w:t>
       </w:r>
     </w:p>
     <w:p>
@@ -222,7 +222,7 @@
               <w:rPr>
                 <w:sz w:val="20"/>
               </w:rPr>
-              <w:t xml:space="preserve">O rodapé mostrava v6.1.1? (sim/não)</w:t>
+              <w:t xml:space="preserve">O rodapé mostrava v6.1.2? (sim/não)</w:t>
             </w:r>
           </w:p>
         </w:tc>
@@ -2678,13 +2678,18 @@
           <w:color w:val="64748B"/>
           <w:sz w:val="18"/>
         </w:rPr>
-        <w:t xml:space="preserve">Versão testada: v6.1.1 (app) · guia: teste-60f.pages.dev/GUIA_DE_TESTE_NF.html</w:t>
+        <w:t xml:space="preserve">Versão testada: v6.1.2 (app) · guia: teste-60f.pages.dev/GUIA_DE_TESTE_NF.html</w:t>
       </w:r>
     </w:p>
     <w:sectPr>
       <w:pgSz w:w="11906" w:h="16838"/>
       <w:pgMar w:top="1134" w:right="850" w:bottom="1134" w:left="850"/>
     </w:sectPr>
+    <w:p>
+      <w:r>
+        <w:t xml:space="preserve">v6.1.2 — Navegação Fiscal firme na barra reconstruída (pintarMenus apagava o markup estático: a v6.1.1 não achava o #menu-nfe → "não muda nada"); modo escuro (.digi-escuro) cobre todos os claros fixos das telas fiscais/faixa/submenu; E2E headless jsdom: 23/23 (aba Fiscal na barra, pin no clique, item navega, faixa fora, shell+menu escuros, claro intacto). Suite 183/0/0.</w:t>
+      </w:r>
+    </w:p>
   </w:body>
 </w:document>
 </file>
</xml_diff>

<commit_message>
Corrige login da nuvem e atualiza artefatos 6.1.3
Co-authored-by: arena-agent <297053741+arena-agent@users.noreply.github.com>
</commit_message>
<xml_diff>
--- a/RELATORIO_EM_BRANCO_TESTE.docx
+++ b/RELATORIO_EM_BRANCO_TESTE.docx
@@ -12,7 +12,7 @@
           <w:color w:val="0A1E8A"/>
           <w:sz w:val="32"/>
         </w:rPr>
-        <w:t xml:space="preserve">Relatório de Teste — Sistema Digicopy v6.1.2</w:t>
+        <w:t xml:space="preserve">Relatório de Teste — Sistema Digicopy v6.1.3</w:t>
       </w:r>
     </w:p>
     <w:p>
@@ -23,7 +23,7 @@
         <w:rPr>
           <w:sz w:val="22"/>
         </w:rPr>
-        <w:t xml:space="preserve">Teste da versão 6.1.2 (Início sem "undefined" + itens clicáveis, menu fiscal completo, permissões e estorno).</w:t>
+        <w:t xml:space="preserve">Teste da versão 6.1.3 (Início sem "undefined" + itens clicáveis, menu fiscal completo, permissões e estorno).</w:t>
       </w:r>
     </w:p>
     <w:p>
@@ -222,7 +222,7 @@
               <w:rPr>
                 <w:sz w:val="20"/>
               </w:rPr>
-              <w:t xml:space="preserve">O rodapé mostrava v6.1.2? (sim/não)</w:t>
+              <w:t xml:space="preserve">O rodapé mostrava v6.1.3? (sim/não)</w:t>
             </w:r>
           </w:p>
         </w:tc>
@@ -2678,7 +2678,7 @@
           <w:color w:val="64748B"/>
           <w:sz w:val="18"/>
         </w:rPr>
-        <w:t xml:space="preserve">Versão testada: v6.1.2 (app) · guia: teste-60f.pages.dev/GUIA_DE_TESTE_NF.html</w:t>
+        <w:t xml:space="preserve">Versão testada: v6.1.3 (app) · guia: teste-60f.pages.dev/GUIA_DE_TESTE_NF.html</w:t>
       </w:r>
     </w:p>
     <w:sectPr>
@@ -2687,7 +2687,7 @@
     </w:sectPr>
     <w:p>
       <w:r>
-        <w:t xml:space="preserve">v6.1.2 — Navegação Fiscal firme na barra reconstruída (pintarMenus apagava o markup estático: a v6.1.1 não achava o #menu-nfe → "não muda nada"); modo escuro (.digi-escuro) cobre todos os claros fixos das telas fiscais/faixa/submenu; E2E headless jsdom: 23/23 (aba Fiscal na barra, pin no clique, item navega, faixa fora, shell+menu escuros, claro intacto). Suite 183/0/0.</w:t>
+        <w:t xml:space="preserve">v6.1.3 — Navegação Fiscal firme na barra reconstruída (pintarMenus apagava o markup estático: a v6.1.1 não achava o #menu-nfe → "não muda nada"); modo escuro (.digi-escuro) cobre todos os claros fixos das telas fiscais/faixa/submenu; E2E headless jsdom: 23/23 (aba Fiscal na barra, pin no clique, item navega, faixa fora, shell+menu escuros, claro intacto). Suite 183/0/0.</w:t>
       </w:r>
     </w:p>
   </w:body>

</xml_diff>

<commit_message>
corrige navegação fiscal e fluxo administrativo
Co-authored-by: arena-agent <297053741+arena-agent@users.noreply.github.com>
</commit_message>
<xml_diff>
--- a/RELATORIO_EM_BRANCO_TESTE.docx
+++ b/RELATORIO_EM_BRANCO_TESTE.docx
@@ -12,7 +12,7 @@
           <w:color w:val="0A1E8A"/>
           <w:sz w:val="32"/>
         </w:rPr>
-        <w:t xml:space="preserve">Relatório de Teste — Sistema Digicopy v6.1.2</w:t>
+        <w:t xml:space="preserve">Relatório de Teste — Sistema Digicopy v6.1.3</w:t>
       </w:r>
     </w:p>
     <w:p>
@@ -23,7 +23,7 @@
         <w:rPr>
           <w:sz w:val="22"/>
         </w:rPr>
-        <w:t xml:space="preserve">Teste da versão 6.1.2 (Início sem "undefined" + itens clicáveis, menu fiscal completo, permissões e estorno).</w:t>
+        <w:t xml:space="preserve">Teste da versão 6.1.3 (Início sem "undefined" + itens clicáveis, menu fiscal completo, permissões e estorno).</w:t>
       </w:r>
     </w:p>
     <w:p>
@@ -222,7 +222,7 @@
               <w:rPr>
                 <w:sz w:val="20"/>
               </w:rPr>
-              <w:t xml:space="preserve">O rodapé mostrava v6.1.2? (sim/não)</w:t>
+              <w:t xml:space="preserve">O rodapé mostrava v6.1.3? (sim/não)</w:t>
             </w:r>
           </w:p>
         </w:tc>
@@ -2678,7 +2678,7 @@
           <w:color w:val="64748B"/>
           <w:sz w:val="18"/>
         </w:rPr>
-        <w:t xml:space="preserve">Versão testada: v6.1.2 (app) · guia: teste-60f.pages.dev/GUIA_DE_TESTE_NF.html</w:t>
+        <w:t xml:space="preserve">Versão testada: v6.1.3 (app) · guia: teste-60f.pages.dev/GUIA_DE_TESTE_NF.html</w:t>
       </w:r>
     </w:p>
     <w:sectPr>
@@ -2687,7 +2687,7 @@
     </w:sectPr>
     <w:p>
       <w:r>
-        <w:t xml:space="preserve">v6.1.2 — Navegação Fiscal firme na barra reconstruída (pintarMenus apagava o markup estático: a v6.1.1 não achava o #menu-nfe → "não muda nada"); modo escuro (.digi-escuro) cobre todos os claros fixos das telas fiscais/faixa/submenu; E2E headless jsdom: 23/23 (aba Fiscal na barra, pin no clique, item navega, faixa fora, shell+menu escuros, claro intacto). Suite 183/0/0.</w:t>
+        <w:t xml:space="preserve">v6.1.3 — Navegação Fiscal firme na barra reconstruída (pintarMenus apagava o markup estático: a v6.1.1 não achava o #menu-nfe → "não muda nada"); modo escuro (.digi-escuro) cobre todos os claros fixos das telas fiscais/faixa/submenu; E2E headless jsdom: 23/23 (aba Fiscal na barra, pin no clique, item navega, faixa fora, shell+menu escuros, claro intacto). Suite 183/0/0.</w:t>
       </w:r>
     </w:p>
   </w:body>

</xml_diff>